<commit_message>
Articulo tecnico ajustado al rango de 1200-1800 palabras y docx regenerado
</commit_message>
<xml_diff>
--- a/entregables/articulo_tecnico.docx
+++ b/entregables/articulo_tecnico.docx
@@ -45,7 +45,7 @@
         <w:pStyle w:val="FirstParagraph"/>
       </w:pPr>
       <w:r>
-        <w:t xml:space="preserve">Este artículo aplica aprendizaje no supervisado a datos públicos del Censo de Población y Vivienda 2020 para segmentar los 36 municipios de Morelos según sus condiciones de vivienda, acceso a servicios básicos y conectividad digital. Después de expresar los conteos censales como proporciones municipales, se estandarizaron ocho indicadores y se entrenó un modelo KMeans, eligiendo tres grupos mediante el método del codo y el coeficiente de silueta. Los perfiles resultantes corresponden a niveles alto (9 municipios), intermedio (7) y bajo (20) de equipamiento urbano, con una brecha digital en el acceso a internet que va de 22.9% de las viviendas en Hueyapan a 73.1% en Cuernavaca. Un árbol de decisión de profundidad dos reproduce 97.2% de la asignación de grupos e identifica a la infraestructura hidráulica —drenaje y agua entubada— como el eje discriminante, por encima de la conectividad. La comparación con los grados de marginación municipales 2020 de CONAPO muestra coincidencia parcial: el perfil alto concentra el 100% de los municipios con marginación muy baja, aunque Morelos no registra ningún municipio con marginación alta o muy alta y los perfiles bajo e intermedio presentan medianas del índice casi idénticas. Los resultados describen patrones territoriales sugerentes para la focalización de políticas públicas, aunque no constituyen categorías oficiales.</w:t>
+        <w:t xml:space="preserve">Este artículo aplica aprendizaje no supervisado a datos públicos del Censo de Población y Vivienda 2020 para segmentar los 36 municipios de Morelos según sus condiciones de vivienda, acceso a servicios básicos y conectividad digital. Tras expresar los conteos como proporciones municipales, se estandarizaron ocho indicadores y se entrenó KMeans, eligiendo tres grupos con el método del codo y el coeficiente de silueta. Los perfiles resultantes corresponden a niveles alto (9 municipios), intermedio (7) y bajo (20) de equipamiento urbano, con una brecha digital en el acceso a internet que va de 22.9% de las viviendas en Hueyapan a 73.1% en Cuernavaca. Un árbol de decisión de profundidad dos reproduce 97.2% de la asignación de grupos e identifica a la infraestructura hidráulica —drenaje y agua entubada— como el eje discriminante, por encima de la conectividad. La comparación con la marginación municipal 2020 de CONAPO muestra coincidencia parcial: el perfil alto concentra el 100% de los municipios con marginación muy baja, Morelos no registra grados altos o muy altos y las medianas del índice de los perfiles bajo e intermedio son casi idénticas. Los resultados describen patrones territoriales sugerentes para la focalización de políticas públicas, aunque no constituyen categorías oficiales.</w:t>
       </w:r>
     </w:p>
     <w:p>
@@ -81,7 +81,7 @@
         <w:pStyle w:val="FirstParagraph"/>
       </w:pPr>
       <w:r>
-        <w:t xml:space="preserve">Morelos es una entidad compacta —36 municipios— con contrastes territoriales marcados: el corredor urbano Cuernavaca–Jiutepec–Cuautla concentra servicios e infraestructura, mientras las zonas altas del norte y los municipios del oriente y sur conservan localidades rurales. A ello se suma un rasgo institucional reciente: tres municipios de nueva creación (Hueyapan, Xoxocotla y Coatetelco), que desde el Censo 2020 cuentan con estadísticas propias. Entender qué municipios comparten condiciones parecidas de vivienda, servicios y conectividad es útil para diseñar políticas públicas diferenciadas, priorizar inversión y dar seguimiento a las desigualdades internas de la entidad.</w:t>
+        <w:t xml:space="preserve">Morelos es una entidad compacta —36 municipios— con contrastes territoriales marcados: el corredor urbano Cuernavaca–Jiutepec–Cuautla concentra servicios e infraestructura, mientras las zonas altas del norte y los municipios del oriente y sur conservan localidades rurales. A ello se suma un rasgo institucional reciente: tres municipios de nueva creación (Hueyapan, Xoxocotla y Coatetelco), que desde el Censo 2020 cuentan con estadísticas propias. Entender qué municipios comparten condiciones parecidas de vivienda, servicios y conectividad es útil para diseñar políticas públicas diferenciadas y priorizar inversión.</w:t>
       </w:r>
     </w:p>
     <w:p>
@@ -105,7 +105,7 @@
         <w:t xml:space="preserve"> </w:t>
       </w:r>
       <w:r>
-        <w:t xml:space="preserve">Para ello se aplicó segmentación con KMeans sobre indicadores censales municipales, se utilizó un árbol de decisión como herramienta de interpretación y se contrastaron los grupos con el índice de marginación municipal de CONAPO. El alcance es deliberadamente acotado —36 observaciones de una sola entidad—, con fuentes públicas oficiales y un flujo de trabajo completamente reproducible (semilla aleatoria fija y datos separados en crudo y procesados).</w:t>
+        <w:t xml:space="preserve">Para ello se aplicó segmentación con KMeans sobre indicadores censales municipales, se utilizó un árbol de decisión como herramienta de interpretación y se contrastaron los grupos con el índice de marginación municipal de CONAPO. El alcance es deliberadamente acotado —36 observaciones de una sola entidad—, con fuentes oficiales y un flujo de trabajo completamente reproducible (semilla fija y datos separados en crudo y procesados).</w:t>
       </w:r>
     </w:p>
     <w:bookmarkEnd w:id="10"/>
@@ -152,7 +152,7 @@
         <w:t xml:space="preserve">Censo de Población y Vivienda 2020 de INEGI</w:t>
       </w:r>
       <w:r>
-        <w:t xml:space="preserve">, descargado del sitio oficial de datos abiertos. El ITER reporta, para cada municipio, conteos de población y vivienda junto con indicadores de educación, servicios y bienes en el hogar. Se seleccionó esta fuente porque es oficial, gratuita, está documentada mediante ficha técnica y diccionario de datos, y permite trabajar directamente al nivel municipal.</w:t>
+        <w:t xml:space="preserve">, descargado del sitio oficial de datos abiertos. El ITER reporta, para cada municipio, conteos de población y vivienda junto con indicadores de educación, servicios y bienes en el hogar; es una fuente oficial, gratuita y documentada con ficha técnica y diccionario de datos, que trabaja directamente al nivel municipal.</w:t>
       </w:r>
     </w:p>
     <w:p>
@@ -173,7 +173,7 @@
         <w:t xml:space="preserve">Índices de Marginación 2020 de CONAPO</w:t>
       </w:r>
       <w:r>
-        <w:t xml:space="preserve">, que asignan a cada municipio un índice y un grado de marginación en cinco categorías. Esta base se utilizó exclusivamente como referencia externa para contrastar los grupos obtenidos, no como entrada del modelo; el cruce por clave municipal (</w:t>
+        <w:t xml:space="preserve">, que asignan a cada municipio un índice y un grado de marginación en cinco categorías, utilizados exclusivamente como referencia externa para contrastar los grupos, no como entrada del modelo; el cruce por clave municipal (</w:t>
       </w:r>
       <w:r>
         <w:rPr>
@@ -182,7 +182,7 @@
         <w:t xml:space="preserve">17000 + MUN</w:t>
       </w:r>
       <w:r>
-        <w:t xml:space="preserve">) verificó población idéntica entre ambas fuentes para los 36 municipios.</w:t>
+        <w:t xml:space="preserve">) verificó población idéntica entre ambas fuentes en los 36 municipios.</w:t>
       </w:r>
     </w:p>
     <w:bookmarkEnd w:id="11"/>
@@ -225,7 +225,7 @@
         <w:t xml:space="preserve">36 municipios</w:t>
       </w:r>
       <w:r>
-        <w:t xml:space="preserve">, incluidos los tres de reciente creación, verificado programáticamente. Se revisaron tipos de dato y valores especiales del censo (</w:t>
+        <w:t xml:space="preserve">, incluidos los tres de reciente creación, verificado programáticamente. Se revisaron tipos de dato y valores especiales (</w:t>
       </w:r>
       <w:r>
         <w:rPr>
@@ -234,7 +234,7 @@
         <w:t xml:space="preserve">*</w:t>
       </w:r>
       <w:r>
-        <w:t xml:space="preserve">, N/D) conforme al diccionario oficial; no se registró ningún valor faltante en las columnas seleccionadas.</w:t>
+        <w:t xml:space="preserve">, N/D) conforme al diccionario oficial, sin valores faltantes en las columnas seleccionadas.</w:t>
       </w:r>
     </w:p>
     <w:p>
@@ -346,7 +346,7 @@
         <w:t xml:space="preserve">multicolinealidad fuerte</w:t>
       </w:r>
       <w:r>
-        <w:t xml:space="preserve">: internet y computadora correlacionan r = 0.95, y escolaridad e internet r = 0.87. Dado que internet y computadora miden prácticamente la misma dimensión, se retiró la segunda del modelo para no sobrerrepresentarla en las distancias; escolaridad e internet se conservaron porque capturan conceptos distintos (educación versus conectividad).</w:t>
+        <w:t xml:space="preserve">: internet y computadora correlacionan r = 0.95, y escolaridad e internet r = 0.87. Dado que internet y computadora miden prácticamente la misma dimensión, se retiró la segunda del modelo; escolaridad e internet se conservaron porque capturan conceptos distintos (educación versus conectividad).</w:t>
       </w:r>
     </w:p>
     <w:p>
@@ -451,7 +451,7 @@
         <w:t xml:space="preserve"> </w:t>
       </w:r>
       <w:r>
-        <w:t xml:space="preserve">(silueta = 0.273), donde el codo se flexiona, porque genera grupos interpretables y útiles para el contraste externo; la preferencia de la métrica por k = 5 se documenta como parte de la decisión, no se oculta.</w:t>
+        <w:t xml:space="preserve">(silueta = 0.273), donde el codo se flexiona, porque genera grupos interpretables y útiles para el contraste externo; la preferencia de la métrica por k = 5 queda documentada como parte de la decisión.</w:t>
       </w:r>
     </w:p>
     <w:p>
@@ -474,7 +474,7 @@
         <w:t xml:space="preserve"> </w:t>
       </w:r>
       <w:r>
-        <w:t xml:space="preserve">de profundidad máxima 3 y mínimo 5 municipios por hoja, usando la etiqueta de cluster como variable objetivo. No se dividió en entrenamiento y prueba porque el objetivo no es predecir, sino traducir las fronteras internas de KMeans a reglas legibles. La etiqueta objetivo proviene de un algoritmo y no representa una categoría oficial.</w:t>
+        <w:t xml:space="preserve">de profundidad máxima 3 y mínimo 5 municipios por hoja, usando la etiqueta de cluster como variable objetivo; no se dividió en entrenamiento y prueba porque el objetivo no es predecir, sino traducir las fronteras internas de KMeans a reglas legibles. La etiqueta proviene de un algoritmo y no representa una categoría oficial.</w:t>
       </w:r>
     </w:p>
     <w:bookmarkEnd w:id="14"/>
@@ -955,7 +955,7 @@
         <w:t xml:space="preserve">bajo</w:t>
       </w:r>
       <w:r>
-        <w:t xml:space="preserve">, Hueyapan aparece como caso extremo estatal: 52.3% de drenaje y 22.9% de internet. Que municipios densamente poblados o turísticamente prominentes queden fuera del perfil alto confirma que los grupos reflejan condiciones de vivienda y servicios, no tamaño de población ni reputación.</w:t>
+        <w:t xml:space="preserve">, Hueyapan aparece como caso extremo estatal: 52.3% de drenaje y 22.9% de internet. Que municipios prominentes queden fuera del perfil alto confirma que los grupos reflejan condiciones de vivienda y servicios, no tamaño ni reputación.</w:t>
       </w:r>
     </w:p>
     <w:p>
@@ -1005,7 +1005,7 @@
         <w:t xml:space="preserve">bajo</w:t>
       </w:r>
       <w:r>
-        <w:t xml:space="preserve">. Las importancias se concentran en dos variables: drenaje (0.56) y agua entubada (0.44); ninguna variable de conectividad aporta a las fronteras. El único municipio mal clasificado es Xoxocotla, cuyo drenaje (98.0%) cae justo en el borde del corte principal.</w:t>
+        <w:t xml:space="preserve">. Las importancias se concentran en dos variables: drenaje (0.56) y agua entubada (0.44); ninguna variable de conectividad aporta a las fronteras. Solo Xoxocotla queda mal clasificado: su drenaje (98.0%) cae justo en el borde del corte principal.</w:t>
       </w:r>
     </w:p>
     <w:p>
@@ -1275,7 +1275,7 @@
         <w:t xml:space="preserve"> </w:t>
       </w:r>
       <w:r>
-        <w:t xml:space="preserve">—drenaje primero, agua entubada después— y no la conectividad, pese a que el gradiente interno de internet sí acompaña a la escolaridad (r = 0.87). Es decir: la conectividad ordena el espectro municipal, pero las fronteras entre grupos las marcan los servicios básicos que aún no están universalizados. Que un árbol de dos niveles explique 97% de los grupos indica que la segmentación descansa en diferencias simples y comunicables: qué tan extendidos están el drenaje y el agua entubada define en gran medida el lugar del municipio en el mapa de condiciones.</w:t>
+        <w:t xml:space="preserve">—drenaje primero, agua entubada después— y no la conectividad, pese a que el gradiente interno de internet acompaña a la escolaridad (r = 0.87). La conectividad ordena el espectro municipal; las fronteras entre grupos las marcan los servicios básicos aún no universalizados. Que un árbol de dos niveles explique 97% de los grupos indica que la segmentación descansa en diferencias simples y comunicables.</w:t>
       </w:r>
     </w:p>
     <w:p>
@@ -1283,7 +1283,7 @@
         <w:pStyle w:val="BodyText"/>
       </w:pPr>
       <w:r>
-        <w:t xml:space="preserve">La comparación con la clasificación oficial de marginación debe leerse con cautela: ambas fuentes provienen del mismo censo y comparten dimensiones conceptuales, la distribución estatal carece de los grados extremos y la coincidencia es parcial, ilustrativa de patrones compatibles más que una validación independiente; tampoco implica que KMeans mida marginación.</w:t>
+        <w:t xml:space="preserve">La comparación con la clasificación oficial de marginación debe leerse con cautela: ambas fuentes provienen del mismo censo y comparten dimensiones conceptuales, y la coincidencia es parcial: ilustra patrones compatibles, no constituye una validación independiente ni implica que KMeans mida marginación.</w:t>
       </w:r>
     </w:p>
     <w:bookmarkEnd w:id="16"/>
@@ -1301,7 +1301,7 @@
         <w:pStyle w:val="FirstParagraph"/>
       </w:pPr>
       <w:r>
-        <w:t xml:space="preserve">Los datos corresponden a un corte temporal único (Censo 2020) y están agregados por municipio, por lo que ocultan heterogeneidad interna (colonias, localidades rurales). Los resultados dependen de las variables seleccionadas, del número de grupos elegido, de la estandarización y de la conversión de conteos a proporciones; decisiones distintas producirían segmentaciones distintas. Con solo 36 observaciones, los clusters son particularmente sensibles a casos extremos como Hueyapan. La variable objetivo del árbol es una etiqueta generada por el propio KMeans, de modo que su precisión mide legibilidad, no validez externa. Los grupos no son categorías oficiales de calidad de vida, la comparación con CONAPO no establece causalidad y pueden existir variables relevantes no incluidas. Los hallazgos deben interpretarse como patrones sugeridos por los datos.</w:t>
+        <w:t xml:space="preserve">Los datos corresponden a un corte temporal único (Censo 2020) y están agregados por municipio, por lo que ocultan heterogeneidad interna (colonias, localidades rurales). Los resultados dependen de las variables seleccionadas, del número de grupos elegido, de la estandarización y de la conversión de conteos a proporciones; decisiones distintas producirían segmentaciones distintas. Con solo 36 observaciones, los clusters son particularmente sensibles a casos extremos como Hueyapan. La variable objetivo del árbol es una etiqueta generada por el propio KMeans, de modo que su precisión mide legibilidad, no validez externa. Los grupos no son categorías oficiales de calidad de vida, la comparación con CONAPO no establece causalidad y pueden existir variables relevantes no incluidas; los hallazgos deben interpretarse como patrones sugeridos por los datos.</w:t>
       </w:r>
     </w:p>
     <w:bookmarkEnd w:id="17"/>
@@ -1319,7 +1319,7 @@
         <w:pStyle w:val="FirstParagraph"/>
       </w:pPr>
       <w:r>
-        <w:t xml:space="preserve">Con datos públicos oficiales y métodos estándar de aprendizaje no supervisado fue posible ordenar los 36 municipios de Morelos en tres perfiles comprensibles, cuantificar una brecha digital de magnitud considerable (23% a 73% de viviendas con internet) y expresar la segmentación en reglas sencillas centradas en la infraestructura hidráulica. La concordancia parcial con los grados de marginación de CONAPO respalda la plausibilidad de los grupos en sus extremos y a la vez advierte sobre la franja media, donde equipamiento urbano y marginación oficial cuentan historias distintas. Como trabajo futuro se proponen la cartografía de los perfiles, la incorporación de series intercensales —que permitirán observar la trayectoria de los municipios de nueva creación— y la extensión del análisis a otras entidades. El notebook, los datasets procesados y todos los resultados son públicos y reproducibles en el repositorio del proyecto.</w:t>
+        <w:t xml:space="preserve">Con datos públicos oficiales y métodos estándar de aprendizaje no supervisado fue posible ordenar los 36 municipios de Morelos en tres perfiles comprensibles, cuantificar una brecha digital considerable (23% a 73% de viviendas con internet) y expresar la segmentación en reglas sencillas centradas en la infraestructura hidráulica. La concordancia parcial con los grados de marginación de CONAPO respalda la plausibilidad de los grupos en sus extremos y advierte sobre la franja media, donde equipamiento urbano y marginación oficial cuentan historias distintas. Como trabajo futuro se proponen cartografiar los perfiles, incorporar series intercensales —que permitirán observar la trayectoria de los municipios de nueva creación— y extender el análisis a otras entidades. El notebook, los datasets procesados y todos los resultados son públicos y reproducibles en el repositorio del proyecto.</w:t>
       </w:r>
     </w:p>
     <w:bookmarkEnd w:id="18"/>

</xml_diff>

<commit_message>
Articulo tecnico dentro del limite de 1800 palabras y docx sincronizado
</commit_message>
<xml_diff>
--- a/entregables/articulo_tecnico.docx
+++ b/entregables/articulo_tecnico.docx
@@ -45,7 +45,7 @@
         <w:pStyle w:val="FirstParagraph"/>
       </w:pPr>
       <w:r>
-        <w:t xml:space="preserve">Este artículo aplica aprendizaje no supervisado a datos públicos del Censo de Población y Vivienda 2020 para segmentar los 36 municipios de Morelos según sus condiciones de vivienda, acceso a servicios básicos y conectividad digital. Tras expresar los conteos como proporciones municipales, se estandarizaron ocho indicadores y se entrenó KMeans, eligiendo tres grupos con el método del codo y el coeficiente de silueta. Los perfiles resultantes corresponden a niveles alto (9 municipios), intermedio (7) y bajo (20) de equipamiento urbano, con una brecha digital en el acceso a internet que va de 22.9% de las viviendas en Hueyapan a 73.1% en Cuernavaca. Un árbol de decisión de profundidad dos reproduce 97.2% de la asignación de grupos e identifica a la infraestructura hidráulica —drenaje y agua entubada— como el eje discriminante, por encima de la conectividad. La comparación con la marginación municipal 2020 de CONAPO muestra coincidencia parcial: el perfil alto concentra el 100% de los municipios con marginación muy baja, Morelos no registra grados altos o muy altos y las medianas del índice de los perfiles bajo e intermedio son casi idénticas. Los resultados describen patrones territoriales sugerentes para la focalización de políticas públicas, aunque no constituyen categorías oficiales.</w:t>
+        <w:t xml:space="preserve">Este artículo aplica aprendizaje no supervisado a datos públicos del Censo de Población y Vivienda 2020 para segmentar los 36 municipios de Morelos según sus condiciones de vivienda, acceso a servicios básicos y conectividad digital. Tras expresar los conteos como proporciones municipales, se estandarizaron ocho indicadores y se entrenó KMeans, eligiendo tres grupos con el método del codo y el coeficiente de silueta. Los perfiles resultantes son alto (9 municipios), intermedio (7) y bajo (20) de equipamiento urbano, con una brecha digital de 22.9% de viviendas con internet en Hueyapan a 73.1% en Cuernavaca. Un árbol de decisión de profundidad dos reproduce 97.2% de la asignación de grupos e identifica a la infraestructura hidráulica —drenaje y agua entubada— como el eje discriminante, por encima de la conectividad. La comparación con la marginación municipal 2020 de CONAPO muestra coincidencia parcial: el perfil alto concentra el 100% de los municipios con marginación muy baja, Morelos no registra grados altos o muy altos y las medianas del índice de los perfiles bajo e intermedio son casi idénticas. Los resultados describen patrones territoriales sugerentes para la focalización de políticas públicas, aunque no constituyen categorías oficiales.</w:t>
       </w:r>
     </w:p>
     <w:p>
@@ -81,7 +81,7 @@
         <w:pStyle w:val="FirstParagraph"/>
       </w:pPr>
       <w:r>
-        <w:t xml:space="preserve">Morelos es una entidad compacta —36 municipios— con contrastes territoriales marcados: el corredor urbano Cuernavaca–Jiutepec–Cuautla concentra servicios e infraestructura, mientras las zonas altas del norte y los municipios del oriente y sur conservan localidades rurales. A ello se suma un rasgo institucional reciente: tres municipios de nueva creación (Hueyapan, Xoxocotla y Coatetelco), que desde el Censo 2020 cuentan con estadísticas propias. Entender qué municipios comparten condiciones parecidas de vivienda, servicios y conectividad es útil para diseñar políticas públicas diferenciadas y priorizar inversión.</w:t>
+        <w:t xml:space="preserve">Morelos es una entidad compacta —36 municipios— con contrastes territoriales marcados: el corredor urbano Cuernavaca–Jiutepec–Cuautla concentra servicios e infraestructura, mientras las zonas altas del norte y los municipios del oriente y sur conservan localidades rurales. A ello se suma que tres municipios de nueva creación (Hueyapan, Xoxocotla y Coatetelco) cuentan con estadísticas propias desde el Censo 2020. Entender qué municipios comparten condiciones parecidas de vivienda, servicios y conectividad es útil para diseñar políticas públicas diferenciadas y priorizar inversión.</w:t>
       </w:r>
     </w:p>
     <w:p>
@@ -105,7 +105,7 @@
         <w:t xml:space="preserve"> </w:t>
       </w:r>
       <w:r>
-        <w:t xml:space="preserve">Para ello se aplicó segmentación con KMeans sobre indicadores censales municipales, se utilizó un árbol de decisión como herramienta de interpretación y se contrastaron los grupos con el índice de marginación municipal de CONAPO. El alcance es deliberadamente acotado —36 observaciones de una sola entidad—, con fuentes oficiales y un flujo de trabajo completamente reproducible (semilla fija y datos separados en crudo y procesados).</w:t>
+        <w:t xml:space="preserve">Para ello se aplicó KMeans sobre indicadores censales municipales, se interpretaron los grupos con un árbol de decisión y se contrastaron con el índice de marginación municipal de CONAPO. El alcance es deliberadamente acotado —36 observaciones de una sola entidad—, con fuentes oficiales y un flujo de trabajo completamente reproducible (semilla fija y datos separados en crudo y procesados).</w:t>
       </w:r>
     </w:p>
     <w:bookmarkEnd w:id="10"/>
@@ -200,19 +200,16 @@
         <w:pStyle w:val="FirstParagraph"/>
       </w:pPr>
       <w:r>
-        <w:t xml:space="preserve">Del archivo nacional del ITER se filtraron los registros municipales (localidad</w:t>
-      </w:r>
-      <w:r>
-        <w:t xml:space="preserve"> </w:t>
+        <w:t xml:space="preserve">Del ITER nacional se filtraron los registros municipales (</w:t>
       </w:r>
       <w:r>
         <w:rPr>
           <w:rStyle w:val="VerbatimChar"/>
         </w:rPr>
-        <w:t xml:space="preserve">"0000"</w:t>
-      </w:r>
-      <w:r>
-        <w:t xml:space="preserve">) de la entidad 17, excluyendo la fila de total estatal, lo que arroja exactamente</w:t>
+        <w:t xml:space="preserve">LOC == "0000"</w:t>
+      </w:r>
+      <w:r>
+        <w:t xml:space="preserve">) de la entidad 17, excluido el total estatal: exactamente</w:t>
       </w:r>
       <w:r>
         <w:t xml:space="preserve"> </w:t>
@@ -225,7 +222,7 @@
         <w:t xml:space="preserve">36 municipios</w:t>
       </w:r>
       <w:r>
-        <w:t xml:space="preserve">, incluidos los tres de reciente creación, verificado programáticamente. Se revisaron tipos de dato y valores especiales (</w:t>
+        <w:t xml:space="preserve">, incluidos los tres de reciente creación, verificado programáticamente. Los tipos de dato y valores especiales (</w:t>
       </w:r>
       <w:r>
         <w:rPr>
@@ -234,7 +231,7 @@
         <w:t xml:space="preserve">*</w:t>
       </w:r>
       <w:r>
-        <w:t xml:space="preserve">, N/D) conforme al diccionario oficial, sin valores faltantes en las columnas seleccionadas.</w:t>
+        <w:t xml:space="preserve">, N/D) se revisaron conforme al diccionario oficial, sin valores faltantes en las columnas seleccionadas.</w:t>
       </w:r>
     </w:p>
     <w:p>
@@ -302,7 +299,7 @@
         <w:t xml:space="preserve">PROM_OCUP</w:t>
       </w:r>
       <w:r>
-        <w:t xml:space="preserve">). La población total se conservó solo como variable descriptiva, fuera del modelo, para evitar que el tamaño de los municipios dominara el cálculo de similitudes. El resultado fue un dataset procesado de 36 filas por 22 columnas, sin valores nulos.</w:t>
+        <w:t xml:space="preserve">). La población total quedó fuera del modelo para evitar que el tamaño municipal dominara el cálculo de similitudes. El resultado fue un dataset procesado de 36 filas por 22 columnas, sin valores nulos.</w:t>
       </w:r>
     </w:p>
     <w:bookmarkEnd w:id="12"/>
@@ -333,7 +330,7 @@
         <w:t xml:space="preserve">brecha digital considerable</w:t>
       </w:r>
       <w:r>
-        <w:t xml:space="preserve">: la proporción de viviendas con internet va de 22.9% en Hueyapan a 73.1% en Cuernavaca, poco más de tres veces; la escolaridad promedio acompaña ese gradiente (7.4 frente a 11.4 años aprobados; el mínimo estatal lo registra Coatetelco con 6.9). Segundo, una</w:t>
+        <w:t xml:space="preserve">: la proporción de viviendas con internet va de 22.9% en Hueyapan a 73.1% en Cuernavaca, poco más de tres veces; la escolaridad promedio acompaña ese gradiente (7.4 frente a 11.4 años; mínimo estatal: Coatetelco, 6.9). Segundo, una</w:t>
       </w:r>
       <w:r>
         <w:t xml:space="preserve"> </w:t>
@@ -372,7 +369,7 @@
         <w:pStyle w:val="FirstParagraph"/>
       </w:pPr>
       <w:r>
-        <w:t xml:space="preserve">El flujo fue: estandarización con</w:t>
+        <w:t xml:space="preserve">El flujo fue estandarización con</w:t>
       </w:r>
       <w:r>
         <w:t xml:space="preserve"> </w:t>
@@ -387,7 +384,7 @@
         <w:t xml:space="preserve"> </w:t>
       </w:r>
       <w:r>
-        <w:t xml:space="preserve">(las variables tienen escalas distintas: proporciones, años y personas por vivienda) y posterior aplicación de</w:t>
+        <w:t xml:space="preserve">—proporciones, años y personas por vivienda tienen escalas distintas— y</w:t>
       </w:r>
       <w:r>
         <w:t xml:space="preserve"> </w:t>
@@ -427,7 +424,7 @@
         <w:t xml:space="preserve">random_state = 42</w:t>
       </w:r>
       <w:r>
-        <w:t xml:space="preserve">) para garantizar reproducibilidad.</w:t>
+        <w:t xml:space="preserve">) para reproducibilidad.</w:t>
       </w:r>
     </w:p>
     <w:p>
@@ -435,7 +432,7 @@
         <w:pStyle w:val="BodyText"/>
       </w:pPr>
       <w:r>
-        <w:t xml:space="preserve">El número de grupos se evaluó con dos criterios para k entre 2 y 10: método del codo (inercia) y coeficiente de silueta. La silueta alcanza su máximo en k = 5 (0.303), pero esa solución produce grupos de solo 1 y 2 municipios —uno quedaría integrado únicamente por Hueyapan, aislado por su drenaje extremadamente bajo—, lo que no es interpretable ni útil. Se eligió</w:t>
+        <w:t xml:space="preserve">El número de grupos se evaluó para k entre 2 y 10 con el codo (inercia) y la silueta. La silueta alcanza su máximo en k = 5 (0.303), pero esa solución produce grupos de solo 1 y 2 municipios —uno quedaría integrado únicamente por Hueyapan, aislado por su drenaje extremadamente bajo—, lo que no es interpretable ni útil. Se eligió</w:t>
       </w:r>
       <w:r>
         <w:t xml:space="preserve"> </w:t>
@@ -492,7 +489,7 @@
         <w:pStyle w:val="FirstParagraph"/>
       </w:pPr>
       <w:r>
-        <w:t xml:space="preserve">Los tres perfiles, renombrados por su nivel de conectividad, integran 9 municipios (</w:t>
+        <w:t xml:space="preserve">Los tres perfiles, renombrados por su nivel de conectividad, integran 9 (</w:t>
       </w:r>
       <w:r>
         <w:rPr>
@@ -522,7 +519,7 @@
         <w:t xml:space="preserve">bajo</w:t>
       </w:r>
       <w:r>
-        <w:t xml:space="preserve">). Sus promedios municipales:</w:t>
+        <w:t xml:space="preserve">) municipios:</w:t>
       </w:r>
     </w:p>
     <w:tbl>
@@ -1259,7 +1256,7 @@
         <w:pStyle w:val="FirstParagraph"/>
       </w:pPr>
       <w:r>
-        <w:t xml:space="preserve">Los resultados dibujan tres configuraciones municipales coexistentes en el territorio, cuyo eje diferenciador principal es la</w:t>
+        <w:t xml:space="preserve">Los resultados dibujan tres configuraciones coexistentes, cuyo eje diferenciador principal es la</w:t>
       </w:r>
       <w:r>
         <w:t xml:space="preserve"> </w:t>
@@ -1283,7 +1280,7 @@
         <w:pStyle w:val="BodyText"/>
       </w:pPr>
       <w:r>
-        <w:t xml:space="preserve">La comparación con la clasificación oficial de marginación debe leerse con cautela: ambas fuentes provienen del mismo censo y comparten dimensiones conceptuales, y la coincidencia es parcial: ilustra patrones compatibles, no constituye una validación independiente ni implica que KMeans mida marginación.</w:t>
+        <w:t xml:space="preserve">La comparación con la marginación oficial debe leerse con cautela: ambas fuentes provienen del mismo censo, comparten dimensiones conceptuales y su coincidencia es parcial; ilustra patrones compatibles, no constituye una validación independiente ni implica que KMeans mida marginación.</w:t>
       </w:r>
     </w:p>
     <w:bookmarkEnd w:id="16"/>
@@ -1301,7 +1298,7 @@
         <w:pStyle w:val="FirstParagraph"/>
       </w:pPr>
       <w:r>
-        <w:t xml:space="preserve">Los datos corresponden a un corte temporal único (Censo 2020) y están agregados por municipio, por lo que ocultan heterogeneidad interna (colonias, localidades rurales). Los resultados dependen de las variables seleccionadas, del número de grupos elegido, de la estandarización y de la conversión de conteos a proporciones; decisiones distintas producirían segmentaciones distintas. Con solo 36 observaciones, los clusters son particularmente sensibles a casos extremos como Hueyapan. La variable objetivo del árbol es una etiqueta generada por el propio KMeans, de modo que su precisión mide legibilidad, no validez externa. Los grupos no son categorías oficiales de calidad de vida, la comparación con CONAPO no establece causalidad y pueden existir variables relevantes no incluidas; los hallazgos deben interpretarse como patrones sugeridos por los datos.</w:t>
+        <w:t xml:space="preserve">Los datos corresponden a un corte temporal único (Censo 2020) y están agregados por municipio, por lo que ocultan heterogeneidad interna (colonias, localidades rurales). Los resultados dependen de las variables seleccionadas, del número de grupos elegido, de la estandarización y de la conversión a proporciones; decisiones distintas producirían segmentaciones distintas. Con solo 36 observaciones, los clusters son particularmente sensibles a casos extremos como Hueyapan. La etiqueta que el árbol aprende proviene del propio KMeans, así que su precisión mide legibilidad, no validez externa; los grupos no son categorías oficiales de calidad de vida y la comparación con CONAPO no establece causalidad.</w:t>
       </w:r>
     </w:p>
     <w:bookmarkEnd w:id="17"/>
@@ -1319,7 +1316,7 @@
         <w:pStyle w:val="FirstParagraph"/>
       </w:pPr>
       <w:r>
-        <w:t xml:space="preserve">Con datos públicos oficiales y métodos estándar de aprendizaje no supervisado fue posible ordenar los 36 municipios de Morelos en tres perfiles comprensibles, cuantificar una brecha digital considerable (23% a 73% de viviendas con internet) y expresar la segmentación en reglas sencillas centradas en la infraestructura hidráulica. La concordancia parcial con los grados de marginación de CONAPO respalda la plausibilidad de los grupos en sus extremos y advierte sobre la franja media, donde equipamiento urbano y marginación oficial cuentan historias distintas. Como trabajo futuro se proponen cartografiar los perfiles, incorporar series intercensales —que permitirán observar la trayectoria de los municipios de nueva creación— y extender el análisis a otras entidades. El notebook, los datasets procesados y todos los resultados son públicos y reproducibles en el repositorio del proyecto.</w:t>
+        <w:t xml:space="preserve">Con datos públicos oficiales y métodos estándar de aprendizaje no supervisado fue posible ordenar los 36 municipios de Morelos en tres perfiles comprensibles, cuantificar una brecha digital considerable (23% a 73% de viviendas con internet) y expresar la segmentación en reglas sencillas centradas en la infraestructura hidráulica. La concordancia parcial con los grados de marginación de CONAPO respalda la plausibilidad de los grupos en sus extremos y advierte sobre la franja media, donde equipamiento urbano y marginación oficial cuentan historias distintas. Como trabajo futuro se proponen cartografiar los perfiles, incorporar series intercensales —que mostrarán la trayectoria de los municipios nuevos— y extender el análisis a otras entidades. El notebook, los datasets procesados y todos los resultados son públicos y reproducibles en el repositorio del proyecto.</w:t>
       </w:r>
     </w:p>
     <w:bookmarkEnd w:id="18"/>

</xml_diff>